<commit_message>
Complete Task 3 unsharp masking
</commit_message>
<xml_diff>
--- a/MULEBI_2025025124_Prac1.docx
+++ b/MULEBI_2025025124_Prac1.docx
@@ -246,7 +246,6 @@
     </w:p>
     <w:p/>
     <w:p>
-      <w:bookmarkStart w:id="0" w:name="_GoBack"/>
       <w:r>
         <w:rPr>
           <w:noProof/>
@@ -293,82 +292,438 @@
           </wp:inline>
         </w:drawing>
       </w:r>
+    </w:p>
+    <w:p>
+      <w:r>
+        <w:t>[Figure 3: colour_picker_result.png]</w:t>
+      </w:r>
+    </w:p>
+    <w:p/>
+    <w:p>
+      <w:r>
+        <w:t>Figure 3: Original image, HSV binary mask and isolated pink regions.</w:t>
+      </w:r>
+    </w:p>
+    <w:p/>
+    <w:p>
+      <w:proofErr w:type="spellStart"/>
+      <w:r>
+        <w:t>Colour</w:t>
+      </w:r>
+      <w:proofErr w:type="spellEnd"/>
+      <w:r>
+        <w:t xml:space="preserve">-based selection is easier in HSV than in RGB because HSV separates </w:t>
+      </w:r>
+      <w:proofErr w:type="spellStart"/>
+      <w:r>
+        <w:t>colour</w:t>
+      </w:r>
+      <w:proofErr w:type="spellEnd"/>
+      <w:r>
+        <w:t xml:space="preserve"> information from brightness. The hue channel can therefore be </w:t>
+      </w:r>
+      <w:proofErr w:type="spellStart"/>
+      <w:r>
+        <w:t>thresholded</w:t>
+      </w:r>
+      <w:proofErr w:type="spellEnd"/>
+      <w:r>
+        <w:t xml:space="preserve"> directly, while saturation and value can be used to exclude weak or dark </w:t>
+      </w:r>
+      <w:proofErr w:type="spellStart"/>
+      <w:r>
+        <w:t>colours</w:t>
+      </w:r>
+      <w:proofErr w:type="spellEnd"/>
+      <w:r>
+        <w:t xml:space="preserve">. In RGB, changes in lighting affect the red, green and blue values simultaneously, making it harder to define a stable range for one </w:t>
+      </w:r>
+      <w:proofErr w:type="spellStart"/>
+      <w:r>
+        <w:t>colour</w:t>
+      </w:r>
+      <w:proofErr w:type="spellEnd"/>
+      <w:r>
+        <w:t>.</w:t>
+      </w:r>
+    </w:p>
+    <w:p/>
+    <w:p>
+      <w:r>
+        <w:t xml:space="preserve">The mask successfully isolated most of the cake and its pink or burgundy wrapping. Some surrounding wrapping was also selected because its hue was similar to the cake. This demonstrates that </w:t>
+      </w:r>
+      <w:proofErr w:type="spellStart"/>
+      <w:r>
+        <w:t>colour</w:t>
+      </w:r>
+      <w:proofErr w:type="spellEnd"/>
+      <w:r>
+        <w:t xml:space="preserve"> segmentation cannot distinguish different objects when they have overlapping </w:t>
+      </w:r>
+      <w:proofErr w:type="spellStart"/>
+      <w:r>
+        <w:t>colour</w:t>
+      </w:r>
+      <w:proofErr w:type="spellEnd"/>
+      <w:r>
+        <w:t xml:space="preserve"> ranges.</w:t>
+      </w:r>
+    </w:p>
+    <w:p/>
+    <w:p>
+      <w:pPr>
+        <w:rPr>
+          <w:b/>
+        </w:rPr>
+      </w:pPr>
+      <w:r>
+        <w:rPr>
+          <w:b/>
+        </w:rPr>
+        <w:t>TASK 2: NOISE AND SMOOTHING – A CONTROLLED EXPERIMENT</w:t>
+      </w:r>
+    </w:p>
+    <w:p/>
+    <w:p>
+      <w:r>
+        <w:t>Question</w:t>
+      </w:r>
+    </w:p>
+    <w:p/>
+    <w:p>
+      <w:r>
+        <w:t>Starting from a clean grayscale image, generate one copy with additive Gaussian noise (σ = 15) and another with 5% salt-and-pepper noise. Restore each noisy image using box, Gaussian and median filters with kernel sizes 3, 5 and 7. Implement PSNR using NumPy, report the results, and explain which filter performs best for each noise type.</w:t>
+      </w:r>
+    </w:p>
+    <w:p/>
+    <w:p>
+      <w:r>
+        <w:t>Answer</w:t>
+      </w:r>
+    </w:p>
+    <w:p/>
+    <w:p>
+      <w:r>
+        <w:t xml:space="preserve">The low-light cup photograph was loaded as a grayscale image. Two corrupted copies were generated. The first was created by adding Gaussian noise with a standard deviation of 15. </w:t>
+      </w:r>
+      <w:r>
+        <w:lastRenderedPageBreak/>
+        <w:t>The second was created by randomly replacing 5% of the image pixels with either 0 (pepper) or 255 (salt).</w:t>
+      </w:r>
+    </w:p>
+    <w:p/>
+    <w:p>
+      <w:r>
+        <w:t>The noisy images were restored using box, Gaussian and median filters. Each filter was tested with kernel sizes of 3×3, 5×5 and 7×7. A fixed random seed of 2025025124 was used so that the experiment could be reproduced.</w:t>
+      </w:r>
+    </w:p>
+    <w:p/>
+    <w:p>
+      <w:r>
+        <w:t>PSNR was implemented from its mathematical definition:</w:t>
+      </w:r>
+    </w:p>
+    <w:p/>
+    <w:p>
+      <w:r>
+        <w:t>PSNR = 10 log₁₀(255²/MSE)</w:t>
+      </w:r>
+    </w:p>
+    <w:p/>
+    <w:p>
+      <w:r>
+        <w:t>where MSE is the mean squared error between the clean image and the restored image. A larger PSNR value indicates that the restored image is more similar to the clean reference image.</w:t>
+      </w:r>
+    </w:p>
+    <w:p/>
+    <w:p>
+      <w:r>
+        <w:t>Table 1: PSNR results for Gaussian and salt-and-pepper noise</w:t>
+      </w:r>
+    </w:p>
+    <w:p/>
+    <w:p>
+      <w:r>
+        <w:t>| Noise type      | Filter   | Kernel | PSNR (dB) |</w:t>
+      </w:r>
+    </w:p>
+    <w:p>
+      <w:r>
+        <w:t>| --------------- | -------- | -----: | --------: |</w:t>
+      </w:r>
+    </w:p>
+    <w:p>
+      <w:r>
+        <w:t>| Gaussian        | Box      |    3×3 |    30.540 |</w:t>
+      </w:r>
+    </w:p>
+    <w:p>
+      <w:r>
+        <w:t>| Gaussian        | Box      |    5×5 |    27.819 |</w:t>
+      </w:r>
+    </w:p>
+    <w:p>
+      <w:r>
+        <w:t>| Gaussian        | Box      |    7×7 |    26.000 |</w:t>
+      </w:r>
+    </w:p>
+    <w:p>
+      <w:r>
+        <w:t>| Gaussian        | Gaussian |    3×3 |    31.082 |</w:t>
+      </w:r>
+    </w:p>
+    <w:p>
+      <w:r>
+        <w:t>| Gaussian        | Gaussian |    5×5 |    30.434 |</w:t>
+      </w:r>
+    </w:p>
+    <w:p>
+      <w:r>
+        <w:t>| Gaussian        | Gaussian |    7×7 |    28.871 |</w:t>
+      </w:r>
+    </w:p>
+    <w:p>
+      <w:r>
+        <w:t>| Gaussian        | Median   |    3×3 |    29.913 |</w:t>
+      </w:r>
+    </w:p>
+    <w:p>
+      <w:r>
+        <w:t>| Gaussian        | Median   |    5×5 |    28.434 |</w:t>
+      </w:r>
+    </w:p>
+    <w:p>
+      <w:r>
+        <w:t>| Gaussian        | Median   |    7×7 |    26.656 |</w:t>
+      </w:r>
+    </w:p>
+    <w:p>
+      <w:r>
+        <w:t>| Salt-and-pepper | Box      |    3×3 |    25.821 |</w:t>
+      </w:r>
+    </w:p>
+    <w:p>
+      <w:r>
+        <w:t>| Salt-and-pepper | Box      |    5×5 |    26.100 |</w:t>
+      </w:r>
+    </w:p>
+    <w:p>
+      <w:r>
+        <w:t>| Salt-and-pepper | Box      |    7×7 |    25.154 |</w:t>
+      </w:r>
+    </w:p>
+    <w:p>
+      <w:r>
+        <w:t>| Salt-and-pepper | Gaussian |    3×3 |    25.373 |</w:t>
+      </w:r>
+    </w:p>
+    <w:p>
+      <w:r>
+        <w:t>| Salt-and-pepper | Gaussian |    5×5 |    26.641 |</w:t>
+      </w:r>
+    </w:p>
+    <w:p>
+      <w:r>
+        <w:t>| Salt-and-pepper | Gaussian |    7×7 |    26.752 |</w:t>
+      </w:r>
+    </w:p>
+    <w:p>
+      <w:r>
+        <w:t>| Salt-and-pepper | Median   |    3×3 |    33.948 |</w:t>
+      </w:r>
+    </w:p>
+    <w:p>
+      <w:r>
+        <w:t>| Salt-and-pepper | Median   |    5×5 |    29.386 |</w:t>
+      </w:r>
+    </w:p>
+    <w:p>
+      <w:r>
+        <w:t>| Salt-and-pepper | Median   |    7×7 |    27.002 |</w:t>
+      </w:r>
+    </w:p>
+    <w:p/>
+    <w:p>
+      <w:r>
+        <w:rPr>
+          <w:noProof/>
+        </w:rPr>
+        <w:lastRenderedPageBreak/>
+        <w:drawing>
+          <wp:inline distT="0" distB="0" distL="0" distR="0">
+            <wp:extent cx="5727700" cy="4878705"/>
+            <wp:effectExtent l="0" t="0" r="0" b="0"/>
+            <wp:docPr id="4" name="Picture 4"/>
+            <wp:cNvGraphicFramePr>
+              <a:graphicFrameLocks xmlns:a="http://schemas.openxmlformats.org/drawingml/2006/main" noChangeAspect="1"/>
+            </wp:cNvGraphicFramePr>
+            <a:graphic xmlns:a="http://schemas.openxmlformats.org/drawingml/2006/main">
+              <a:graphicData uri="http://schemas.openxmlformats.org/drawingml/2006/picture">
+                <pic:pic xmlns:pic="http://schemas.openxmlformats.org/drawingml/2006/picture">
+                  <pic:nvPicPr>
+                    <pic:cNvPr id="4" name="gaussian_filter_comparison.png"/>
+                    <pic:cNvPicPr/>
+                  </pic:nvPicPr>
+                  <pic:blipFill>
+                    <a:blip r:embed="rId7" cstate="print">
+                      <a:extLst>
+                        <a:ext uri="{28A0092B-C50C-407E-A947-70E740481C1C}">
+                          <a14:useLocalDpi xmlns:a14="http://schemas.microsoft.com/office/drawing/2010/main" val="0"/>
+                        </a:ext>
+                      </a:extLst>
+                    </a:blip>
+                    <a:stretch>
+                      <a:fillRect/>
+                    </a:stretch>
+                  </pic:blipFill>
+                  <pic:spPr>
+                    <a:xfrm>
+                      <a:off x="0" y="0"/>
+                      <a:ext cx="5727700" cy="4878705"/>
+                    </a:xfrm>
+                    <a:prstGeom prst="rect">
+                      <a:avLst/>
+                    </a:prstGeom>
+                  </pic:spPr>
+                </pic:pic>
+              </a:graphicData>
+            </a:graphic>
+          </wp:inline>
+        </w:drawing>
+      </w:r>
+    </w:p>
+    <w:p>
+      <w:r>
+        <w:t>[Figure 4: gaussian_filter_comparison.png]</w:t>
+      </w:r>
+    </w:p>
+    <w:p/>
+    <w:p>
+      <w:pPr>
+        <w:rPr>
+          <w:b/>
+        </w:rPr>
+      </w:pPr>
+      <w:r>
+        <w:rPr>
+          <w:b/>
+        </w:rPr>
+        <w:t>Figure 4: Box, Gaussian and median filtering results for Gaussian noise.</w:t>
+      </w:r>
+    </w:p>
+    <w:p/>
+    <w:p>
+      <w:r>
+        <w:t xml:space="preserve">For Gaussian noise, the 3×3 Gaussian filter produced the highest PSNR of 31.082 </w:t>
+      </w:r>
+      <w:proofErr w:type="spellStart"/>
+      <w:r>
+        <w:t>dB.</w:t>
+      </w:r>
+      <w:proofErr w:type="spellEnd"/>
+      <w:r>
+        <w:t xml:space="preserve"> The Gaussian filter performs well because it calculates a weighted average in which pixels near the </w:t>
+      </w:r>
+      <w:proofErr w:type="spellStart"/>
+      <w:r>
+        <w:t>centre</w:t>
+      </w:r>
+      <w:proofErr w:type="spellEnd"/>
+      <w:r>
+        <w:t xml:space="preserve"> receive greater weight. This reduces normally distributed intensity variations while preserving more image structure than a simple box average. Larger kernels produced lower PSNR values because they introduced excessive blurring.</w:t>
+      </w:r>
+    </w:p>
+    <w:p>
+      <w:bookmarkStart w:id="0" w:name="_GoBack"/>
+      <w:r>
+        <w:rPr>
+          <w:noProof/>
+        </w:rPr>
+        <w:lastRenderedPageBreak/>
+        <w:drawing>
+          <wp:inline distT="0" distB="0" distL="0" distR="0">
+            <wp:extent cx="5727700" cy="4833620"/>
+            <wp:effectExtent l="0" t="0" r="0" b="5080"/>
+            <wp:docPr id="5" name="Picture 5"/>
+            <wp:cNvGraphicFramePr>
+              <a:graphicFrameLocks xmlns:a="http://schemas.openxmlformats.org/drawingml/2006/main" noChangeAspect="1"/>
+            </wp:cNvGraphicFramePr>
+            <a:graphic xmlns:a="http://schemas.openxmlformats.org/drawingml/2006/main">
+              <a:graphicData uri="http://schemas.openxmlformats.org/drawingml/2006/picture">
+                <pic:pic xmlns:pic="http://schemas.openxmlformats.org/drawingml/2006/picture">
+                  <pic:nvPicPr>
+                    <pic:cNvPr id="5" name="salt_and_pepper_filter_comparison.png"/>
+                    <pic:cNvPicPr/>
+                  </pic:nvPicPr>
+                  <pic:blipFill>
+                    <a:blip r:embed="rId8" cstate="print">
+                      <a:extLst>
+                        <a:ext uri="{28A0092B-C50C-407E-A947-70E740481C1C}">
+                          <a14:useLocalDpi xmlns:a14="http://schemas.microsoft.com/office/drawing/2010/main" val="0"/>
+                        </a:ext>
+                      </a:extLst>
+                    </a:blip>
+                    <a:stretch>
+                      <a:fillRect/>
+                    </a:stretch>
+                  </pic:blipFill>
+                  <pic:spPr>
+                    <a:xfrm>
+                      <a:off x="0" y="0"/>
+                      <a:ext cx="5727700" cy="4833620"/>
+                    </a:xfrm>
+                    <a:prstGeom prst="rect">
+                      <a:avLst/>
+                    </a:prstGeom>
+                  </pic:spPr>
+                </pic:pic>
+              </a:graphicData>
+            </a:graphic>
+          </wp:inline>
+        </w:drawing>
+      </w:r>
       <w:bookmarkEnd w:id="0"/>
     </w:p>
-    <w:p>
-      <w:r>
-        <w:t>[Figure 3: colour_picker_result.png]</w:t>
-      </w:r>
-    </w:p>
-    <w:p/>
-    <w:p>
-      <w:r>
-        <w:t>Figure 3: Original image, HSV binary mask and isolated pink regions.</w:t>
-      </w:r>
-    </w:p>
-    <w:p/>
-    <w:p>
-      <w:proofErr w:type="spellStart"/>
-      <w:r>
-        <w:t>Colour</w:t>
-      </w:r>
-      <w:proofErr w:type="spellEnd"/>
-      <w:r>
-        <w:t xml:space="preserve">-based selection is easier in HSV than in RGB because HSV separates </w:t>
-      </w:r>
-      <w:proofErr w:type="spellStart"/>
-      <w:r>
-        <w:t>colour</w:t>
-      </w:r>
-      <w:proofErr w:type="spellEnd"/>
-      <w:r>
-        <w:t xml:space="preserve"> information from brightness. The hue channel can therefore be </w:t>
-      </w:r>
-      <w:proofErr w:type="spellStart"/>
-      <w:r>
-        <w:t>thresholded</w:t>
-      </w:r>
-      <w:proofErr w:type="spellEnd"/>
-      <w:r>
-        <w:t xml:space="preserve"> directly, while saturation and value can be used to exclude weak or dark </w:t>
-      </w:r>
-      <w:proofErr w:type="spellStart"/>
-      <w:r>
-        <w:t>colours</w:t>
-      </w:r>
-      <w:proofErr w:type="spellEnd"/>
-      <w:r>
-        <w:t xml:space="preserve">. In RGB, changes in lighting affect the red, green and blue values simultaneously, making it harder to define a stable range for one </w:t>
-      </w:r>
-      <w:proofErr w:type="spellStart"/>
-      <w:r>
-        <w:t>colour</w:t>
-      </w:r>
-      <w:proofErr w:type="spellEnd"/>
-      <w:r>
-        <w:t>.</w:t>
-      </w:r>
-    </w:p>
-    <w:p/>
-    <w:p>
-      <w:r>
-        <w:t xml:space="preserve">The mask successfully isolated most of the cake and its pink or burgundy wrapping. Some surrounding wrapping was also selected because its hue was similar to the cake. This demonstrates that </w:t>
-      </w:r>
-      <w:proofErr w:type="spellStart"/>
-      <w:r>
-        <w:t>colour</w:t>
-      </w:r>
-      <w:proofErr w:type="spellEnd"/>
-      <w:r>
-        <w:t xml:space="preserve"> segmentation cannot distinguish different objects when they have overlapping </w:t>
-      </w:r>
-      <w:proofErr w:type="spellStart"/>
-      <w:r>
-        <w:t>colour</w:t>
-      </w:r>
-      <w:proofErr w:type="spellEnd"/>
-      <w:r>
-        <w:t xml:space="preserve"> ranges.</w:t>
+    <w:p/>
+    <w:p>
+      <w:r>
+        <w:t>[Figure 5: salt_and_pepper_filter_comparison.png]</w:t>
+      </w:r>
+    </w:p>
+    <w:p/>
+    <w:p>
+      <w:r>
+        <w:t>Figure 5: Box, Gaussian and median filtering results for salt-and-pepper noise.</w:t>
+      </w:r>
+    </w:p>
+    <w:p/>
+    <w:p>
+      <w:r>
+        <w:t xml:space="preserve">For salt-and-pepper noise, the 3×3 median filter produced the highest PSNR of 33.948 </w:t>
+      </w:r>
+      <w:proofErr w:type="spellStart"/>
+      <w:r>
+        <w:t>dB.</w:t>
+      </w:r>
+      <w:proofErr w:type="spellEnd"/>
+      <w:r>
+        <w:t xml:space="preserve"> The median filter is effective against this noise because isolated black and white pixels </w:t>
+      </w:r>
+      <w:proofErr w:type="gramStart"/>
+      <w:r>
+        <w:t>are</w:t>
+      </w:r>
+      <w:proofErr w:type="gramEnd"/>
+      <w:r>
+        <w:t xml:space="preserve"> extreme outliers. Selecting the median of the </w:t>
+      </w:r>
+      <w:proofErr w:type="spellStart"/>
+      <w:r>
+        <w:t>neighbourhood</w:t>
+      </w:r>
+      <w:proofErr w:type="spellEnd"/>
+      <w:r>
+        <w:t xml:space="preserve"> removes these outliers without averaging them into nearby pixels. Box and Gaussian filters use averaging, so extreme pixel values influence their outputs and cause visible blur. The decline in median-filter performance at 5×5 and 7×7 shows that unnecessarily large kernels remove useful image detail.</w:t>
       </w:r>
     </w:p>
     <w:sectPr>

</xml_diff>

<commit_message>
Task 3 completed successfully. Results saved in: outputs/task3 (.venv) maluba@0000s-Air MULEBI_2025025124_Prac1 % python3 src/task4_edges.py --input images/colourful_cake.jpeg --output-dir outputs/task4      Task 4 completed successfully. Maximum absolute Sobel difference: 0.000000 Results saved in: outputs/task4 (.venv) maluba@0000s-Air MULEBI_2025025124_Prac1 %
</commit_message>
<xml_diff>
--- a/MULEBI_2025025124_Prac1.docx
+++ b/MULEBI_2025025124_Prac1.docx
@@ -634,7 +634,6 @@
       </w:r>
     </w:p>
     <w:p>
-      <w:bookmarkStart w:id="0" w:name="_GoBack"/>
       <w:r>
         <w:rPr>
           <w:noProof/>
@@ -682,48 +681,207 @@
           </wp:inline>
         </w:drawing>
       </w:r>
+    </w:p>
+    <w:p/>
+    <w:p>
+      <w:r>
+        <w:t>[Figure 5: salt_and_pepper_filter_comparison.png]</w:t>
+      </w:r>
+    </w:p>
+    <w:p/>
+    <w:p>
+      <w:r>
+        <w:t>Figure 5: Box, Gaussian and median filtering results for salt-and-pepper noise.</w:t>
+      </w:r>
+    </w:p>
+    <w:p/>
+    <w:p>
+      <w:r>
+        <w:t xml:space="preserve">For salt-and-pepper noise, the 3×3 median filter produced the highest PSNR of 33.948 </w:t>
+      </w:r>
+      <w:proofErr w:type="spellStart"/>
+      <w:r>
+        <w:t>dB.</w:t>
+      </w:r>
+      <w:proofErr w:type="spellEnd"/>
+      <w:r>
+        <w:t xml:space="preserve"> The median filter is effective against this noise because isolated black and white pixels </w:t>
+      </w:r>
+      <w:proofErr w:type="gramStart"/>
+      <w:r>
+        <w:t>are</w:t>
+      </w:r>
+      <w:proofErr w:type="gramEnd"/>
+      <w:r>
+        <w:t xml:space="preserve"> extreme outliers. Selecting the median of the </w:t>
+      </w:r>
+      <w:proofErr w:type="spellStart"/>
+      <w:r>
+        <w:t>neighbourhood</w:t>
+      </w:r>
+      <w:proofErr w:type="spellEnd"/>
+      <w:r>
+        <w:t xml:space="preserve"> removes these outliers without averaging them into nearby pixels. Box and Gaussian filters use averaging, so extreme pixel values influence their outputs and cause visible blur. The decline in median-filter performance at 5×5 and 7×7 shows that unnecessarily large kernels remove useful image detail.</w:t>
+      </w:r>
+    </w:p>
+    <w:p/>
+    <w:p/>
+    <w:p>
+      <w:pPr>
+        <w:rPr>
+          <w:b/>
+        </w:rPr>
+      </w:pPr>
+      <w:r>
+        <w:rPr>
+          <w:b/>
+        </w:rPr>
+        <w:t>TASK 3: SHARPENING WITH UNSHARP MASKING</w:t>
+      </w:r>
+    </w:p>
+    <w:p/>
+    <w:p>
+      <w:r>
+        <w:t>Question</w:t>
+      </w:r>
+    </w:p>
+    <w:p/>
+    <w:p>
+      <w:r>
+        <w:t xml:space="preserve">Build an </w:t>
+      </w:r>
+      <w:proofErr w:type="spellStart"/>
+      <w:r>
+        <w:t>unsharp</w:t>
+      </w:r>
+      <w:proofErr w:type="spellEnd"/>
+      <w:r>
+        <w:t xml:space="preserve"> mask using the expression:</w:t>
+      </w:r>
+    </w:p>
+    <w:p/>
+    <w:p>
+      <w:r>
+        <w:t>sharpened = original + amount × (original − blurred)</w:t>
+      </w:r>
+    </w:p>
+    <w:p/>
+    <w:p>
+      <w:r>
+        <w:t>Show results for amounts of 0.5, 1.0 and 2.0, and identify where halo artefacts begin to appear. Perform the calculations using floating-point values and clip the results before converting them to uint8.</w:t>
+      </w:r>
+    </w:p>
+    <w:p/>
+    <w:p>
+      <w:r>
+        <w:t>Answer</w:t>
+      </w:r>
+    </w:p>
+    <w:p/>
+    <w:p>
+      <w:proofErr w:type="spellStart"/>
+      <w:r>
+        <w:t>Unsharp</w:t>
+      </w:r>
+      <w:proofErr w:type="spellEnd"/>
+      <w:r>
+        <w:t xml:space="preserve"> masking was applied to the </w:t>
+      </w:r>
+      <w:proofErr w:type="spellStart"/>
+      <w:r>
+        <w:t>colourful</w:t>
+      </w:r>
+      <w:proofErr w:type="spellEnd"/>
+      <w:r>
+        <w:t xml:space="preserve"> cake image. The original image was first converted to a 32-bit floating-point representation. A 5×5 Gaussian filter was used to produce a blurred copy. The blurred image was subtracted from the original to obtain a detail mask containing high-frequency information such as edges and fine texture.</w:t>
+      </w:r>
+    </w:p>
+    <w:p/>
+    <w:p>
+      <w:r>
+        <w:t>The detail mask was multiplied by sharpening amounts of 0.5, 1.0 and 2.0 and then added to the original image. Before conversion back to uint8, the results were clipped to the valid pixel range of 0–255. This prevented overflow and underflow from producing incorrect pixel values.</w:t>
+      </w:r>
+    </w:p>
+    <w:p/>
+    <w:p>
+      <w:bookmarkStart w:id="0" w:name="_GoBack"/>
+      <w:r>
+        <w:rPr>
+          <w:noProof/>
+        </w:rPr>
+        <w:drawing>
+          <wp:inline distT="0" distB="0" distL="0" distR="0">
+            <wp:extent cx="5727700" cy="1850390"/>
+            <wp:effectExtent l="0" t="0" r="0" b="3810"/>
+            <wp:docPr id="6" name="Picture 6"/>
+            <wp:cNvGraphicFramePr>
+              <a:graphicFrameLocks xmlns:a="http://schemas.openxmlformats.org/drawingml/2006/main" noChangeAspect="1"/>
+            </wp:cNvGraphicFramePr>
+            <a:graphic xmlns:a="http://schemas.openxmlformats.org/drawingml/2006/main">
+              <a:graphicData uri="http://schemas.openxmlformats.org/drawingml/2006/picture">
+                <pic:pic xmlns:pic="http://schemas.openxmlformats.org/drawingml/2006/picture">
+                  <pic:nvPicPr>
+                    <pic:cNvPr id="6" name="unsharp_comparison.png"/>
+                    <pic:cNvPicPr/>
+                  </pic:nvPicPr>
+                  <pic:blipFill>
+                    <a:blip r:embed="rId9" cstate="print">
+                      <a:extLst>
+                        <a:ext uri="{28A0092B-C50C-407E-A947-70E740481C1C}">
+                          <a14:useLocalDpi xmlns:a14="http://schemas.microsoft.com/office/drawing/2010/main" val="0"/>
+                        </a:ext>
+                      </a:extLst>
+                    </a:blip>
+                    <a:stretch>
+                      <a:fillRect/>
+                    </a:stretch>
+                  </pic:blipFill>
+                  <pic:spPr>
+                    <a:xfrm>
+                      <a:off x="0" y="0"/>
+                      <a:ext cx="5727700" cy="1850390"/>
+                    </a:xfrm>
+                    <a:prstGeom prst="rect">
+                      <a:avLst/>
+                    </a:prstGeom>
+                  </pic:spPr>
+                </pic:pic>
+              </a:graphicData>
+            </a:graphic>
+          </wp:inline>
+        </w:drawing>
+      </w:r>
       <w:bookmarkEnd w:id="0"/>
     </w:p>
-    <w:p/>
-    <w:p>
-      <w:r>
-        <w:t>[Figure 5: salt_and_pepper_filter_comparison.png]</w:t>
-      </w:r>
-    </w:p>
-    <w:p/>
-    <w:p>
-      <w:r>
-        <w:t>Figure 5: Box, Gaussian and median filtering results for salt-and-pepper noise.</w:t>
-      </w:r>
-    </w:p>
-    <w:p/>
-    <w:p>
-      <w:r>
-        <w:t xml:space="preserve">For salt-and-pepper noise, the 3×3 median filter produced the highest PSNR of 33.948 </w:t>
-      </w:r>
-      <w:proofErr w:type="spellStart"/>
-      <w:r>
-        <w:t>dB.</w:t>
-      </w:r>
-      <w:proofErr w:type="spellEnd"/>
-      <w:r>
-        <w:t xml:space="preserve"> The median filter is effective against this noise because isolated black and white pixels </w:t>
-      </w:r>
-      <w:proofErr w:type="gramStart"/>
-      <w:r>
-        <w:t>are</w:t>
-      </w:r>
-      <w:proofErr w:type="gramEnd"/>
-      <w:r>
-        <w:t xml:space="preserve"> extreme outliers. Selecting the median of the </w:t>
-      </w:r>
-      <w:proofErr w:type="spellStart"/>
-      <w:r>
-        <w:t>neighbourhood</w:t>
-      </w:r>
-      <w:proofErr w:type="spellEnd"/>
-      <w:r>
-        <w:t xml:space="preserve"> removes these outliers without averaging them into nearby pixels. Box and Gaussian filters use averaging, so extreme pixel values influence their outputs and cause visible blur. The decline in median-filter performance at 5×5 and 7×7 shows that unnecessarily large kernels remove useful image detail.</w:t>
+    <w:p>
+      <w:r>
+        <w:t>[Figure 6: unsharp_comparison.png]</w:t>
+      </w:r>
+    </w:p>
+    <w:p/>
+    <w:p>
+      <w:r>
+        <w:t xml:space="preserve">Figure 6: Original image and </w:t>
+      </w:r>
+      <w:proofErr w:type="spellStart"/>
+      <w:r>
+        <w:t>unsharp</w:t>
+      </w:r>
+      <w:proofErr w:type="spellEnd"/>
+      <w:r>
+        <w:t>-masking results for amounts 0.5, 1.0 and 2.0.</w:t>
+      </w:r>
+    </w:p>
+    <w:p/>
+    <w:p>
+      <w:r>
+        <w:t>An amount of 0.5 produced mild sharpening and retained a relatively natural appearance. An amount of 1.0 made the icing, lettering and object boundaries more distinct. At an amount of 2.0, the effect became aggressive, with stronger bright and dark outlines appearing around high-contrast regions such as the black writing, cake boundary and wrapper. These unnatural outlines are halo artefacts.</w:t>
+      </w:r>
+    </w:p>
+    <w:p/>
+    <w:p>
+      <w:r>
+        <w:t>Increasing the amount strengthens the extracted detail, but it can also exaggerate noise and create unrealistic edges. Therefore, the amount parameter must balance improved sharpness against visual artefacts.</w:t>
       </w:r>
     </w:p>
     <w:sectPr>

</xml_diff>